<commit_message>
CÔNG TY TNHH VẬN TẢI BÌNH MINH BÌNH DƯƠNG
</commit_message>
<xml_diff>
--- a/DKKDApp/bin/Debug/net8.0-windows/Điều lệ công ty_DA_DIEN.docx
+++ b/DKKDApp/bin/Debug/net8.0-windows/Điều lệ công ty_DA_DIEN.docx
@@ -144,7 +144,7 @@
           <w:sz w:val="26"/>
           <w:szCs w:val="26"/>
         </w:rPr>
-        <w:t>CÔNG TY TNHH VẬN TẢI BÌNH MINH NGHI</w:t>
+        <w:t>CÔNG TY TNHH VẬN TẢI BÌNH MINH BÌNH DƯƠNG</w:t>
       </w:r>
     </w:p>
     <w:p>
@@ -351,7 +351,7 @@
           <w:sz w:val="26"/>
           <w:szCs w:val="26"/>
         </w:rPr>
-        <w:t>CÔNG TY TNHH VẬN TẢI BÌNH MINH NGHI</w:t>
+        <w:t>CÔNG TY TNHH VẬN TẢI BÌNH MINH BÌNH DƯƠNG</w:t>
       </w:r>
       <w:r>
         <w:rPr>
@@ -375,7 +375,7 @@
           <w:sz w:val="26"/>
           <w:szCs w:val="26"/>
         </w:rPr>
-        <w:t>CÔNG TY TNHH VẬN TẢI BÌNH MINH NGHI</w:t>
+        <w:t>CÔNG TY TNHH VẬN TẢI BÌNH MINH BÌNH DƯƠNG</w:t>
       </w:r>
       <w:r>
         <w:rPr>
@@ -685,7 +685,7 @@
           <w:sz w:val="26"/>
           <w:szCs w:val="26"/>
         </w:rPr>
-        <w:t>CÔNG TY TNHH VẬN TẢI BÌNH MINH NGHI</w:t>
+        <w:t>CÔNG TY TNHH VẬN TẢI BÌNH MINH BÌNH DƯƠNG</w:t>
       </w:r>
     </w:p>
     <w:tbl>

</xml_diff>